<commit_message>
Update Module 3 documents with GitHub Pages URL
</commit_message>
<xml_diff>
--- a/module-3/Cortez_Mod3_3.docx
+++ b/module-3/Cortez_Mod3_3.docx
@@ -70,9 +70,14 @@
       <w:pPr>
         <w:jc w:val="both"/>
       </w:pPr>
-      <w:r>
-        <w:t>[INSERT GITHUB PAGES URL HERE AFTER THE FILES ARE PUSHED TO GITHUB]</w:t>
-      </w:r>
+      <w:hyperlink r:id="rId4" w:history="1">
+        <w:r>
+          <w:rPr>
+            <w:rStyle w:val="Hyperlink"/>
+          </w:rPr>
+          <w:t>https://luiscortezusa2018.github.io/csd-340/</w:t>
+        </w:r>
+      </w:hyperlink>
     </w:p>
     <w:p>
       <w:pPr>
@@ -116,6 +121,7 @@
         <w:rPr>
           <w:b/>
           <w:bCs/>
+          <w:noProof/>
         </w:rPr>
         <w:drawing>
           <wp:inline distT="0" distB="0" distL="0" distR="0" wp14:anchorId="0DCB7823" wp14:editId="37087043">
@@ -147,7 +153,7 @@
                     </pic:cNvPicPr>
                   </pic:nvPicPr>
                   <pic:blipFill>
-                    <a:blip r:embed="rId4"/>
+                    <a:blip r:embed="rId5"/>
                     <a:stretch>
                       <a:fillRect/>
                     </a:stretch>
@@ -223,6 +229,7 @@
         <w:rPr>
           <w:b/>
           <w:bCs/>
+          <w:noProof/>
         </w:rPr>
         <w:drawing>
           <wp:inline distT="0" distB="0" distL="0" distR="0" wp14:anchorId="0ACA6B65" wp14:editId="72EE66AE">
@@ -254,7 +261,7 @@
                     </pic:cNvPicPr>
                   </pic:nvPicPr>
                   <pic:blipFill>
-                    <a:blip r:embed="rId5"/>
+                    <a:blip r:embed="rId6"/>
                     <a:stretch>
                       <a:fillRect/>
                     </a:stretch>
@@ -378,6 +385,9 @@
         <w:jc w:val="both"/>
       </w:pPr>
       <w:r>
+        <w:rPr>
+          <w:noProof/>
+        </w:rPr>
         <w:drawing>
           <wp:inline distT="0" distB="0" distL="0" distR="0" wp14:anchorId="027B09E0" wp14:editId="6CFDD607">
             <wp:extent cx="5943600" cy="3098165"/>
@@ -408,7 +418,7 @@
                     </pic:cNvPicPr>
                   </pic:nvPicPr>
                   <pic:blipFill>
-                    <a:blip r:embed="rId6"/>
+                    <a:blip r:embed="rId7"/>
                     <a:stretch>
                       <a:fillRect/>
                     </a:stretch>
@@ -1367,6 +1377,29 @@
       <w:spacing w:val="5"/>
     </w:rPr>
   </w:style>
+  <w:style w:type="character" w:styleId="Hyperlink">
+    <w:name w:val="Hyperlink"/>
+    <w:basedOn w:val="DefaultParagraphFont"/>
+    <w:uiPriority w:val="99"/>
+    <w:unhideWhenUsed/>
+    <w:rsid w:val="002440D5"/>
+    <w:rPr>
+      <w:color w:val="467886" w:themeColor="hyperlink"/>
+      <w:u w:val="single"/>
+    </w:rPr>
+  </w:style>
+  <w:style w:type="character" w:styleId="UnresolvedMention">
+    <w:name w:val="Unresolved Mention"/>
+    <w:basedOn w:val="DefaultParagraphFont"/>
+    <w:uiPriority w:val="99"/>
+    <w:semiHidden/>
+    <w:unhideWhenUsed/>
+    <w:rsid w:val="002440D5"/>
+    <w:rPr>
+      <w:color w:val="605E5C"/>
+      <w:shd w:val="clear" w:color="auto" w:fill="E1DFDD"/>
+    </w:rPr>
+  </w:style>
 </w:styles>
 </file>
 

</xml_diff>